<commit_message>
updating changes for Milestone2
</commit_message>
<xml_diff>
--- a/Milestone2/CSC500 Module 6 - Portfolio Milestone.docx
+++ b/Milestone2/CSC500 Module 6 - Portfolio Milestone.docx
@@ -2008,6 +2008,7 @@
       <w:r>
         <w:rPr>
           <w:rFonts w:ascii="Calibri" w:hAnsi="Calibri" w:cs="Calibri"/>
+          <w:noProof/>
         </w:rPr>
         <w:drawing>
           <wp:inline distT="0" distB="0" distL="0" distR="0" wp14:anchorId="261EB2CF" wp14:editId="46A231CF">
@@ -2069,6 +2070,7 @@
       <w:r>
         <w:rPr>
           <w:rFonts w:ascii="Calibri" w:hAnsi="Calibri" w:cs="Calibri"/>
+          <w:noProof/>
         </w:rPr>
         <w:lastRenderedPageBreak/>
         <w:drawing>
@@ -2131,6 +2133,7 @@
       <w:r>
         <w:rPr>
           <w:rFonts w:ascii="Calibri" w:hAnsi="Calibri" w:cs="Calibri"/>
+          <w:noProof/>
         </w:rPr>
         <w:drawing>
           <wp:inline distT="0" distB="0" distL="0" distR="0" wp14:anchorId="3977ECAD" wp14:editId="0013B407">
@@ -2192,6 +2195,7 @@
       <w:r>
         <w:rPr>
           <w:rFonts w:ascii="Calibri" w:hAnsi="Calibri" w:cs="Calibri"/>
+          <w:noProof/>
         </w:rPr>
         <w:lastRenderedPageBreak/>
         <w:drawing>
@@ -2254,6 +2258,7 @@
       <w:r>
         <w:rPr>
           <w:rFonts w:ascii="Calibri" w:hAnsi="Calibri" w:cs="Calibri"/>
+          <w:noProof/>
         </w:rPr>
         <w:drawing>
           <wp:inline distT="0" distB="0" distL="0" distR="0" wp14:anchorId="68CBEB48" wp14:editId="38762546">
@@ -2308,6 +2313,7 @@
       <w:r>
         <w:rPr>
           <w:rFonts w:ascii="Calibri" w:hAnsi="Calibri" w:cs="Calibri"/>
+          <w:noProof/>
         </w:rPr>
         <w:lastRenderedPageBreak/>
         <w:drawing>
@@ -2370,6 +2376,7 @@
       <w:r>
         <w:rPr>
           <w:rFonts w:ascii="Calibri" w:hAnsi="Calibri" w:cs="Calibri"/>
+          <w:noProof/>
         </w:rPr>
         <w:drawing>
           <wp:inline distT="0" distB="0" distL="0" distR="0" wp14:anchorId="60126905" wp14:editId="1B0B1E40">
@@ -2431,6 +2438,7 @@
       <w:r>
         <w:rPr>
           <w:rFonts w:ascii="Calibri" w:hAnsi="Calibri" w:cs="Calibri"/>
+          <w:noProof/>
         </w:rPr>
         <w:lastRenderedPageBreak/>
         <w:drawing>
@@ -2493,6 +2501,7 @@
       <w:r>
         <w:rPr>
           <w:rFonts w:ascii="Calibri" w:hAnsi="Calibri" w:cs="Calibri"/>
+          <w:noProof/>
         </w:rPr>
         <w:drawing>
           <wp:inline distT="0" distB="0" distL="0" distR="0" wp14:anchorId="0DC77E0F" wp14:editId="1BAEB81A">
@@ -2637,6 +2646,7 @@
       <w:r>
         <w:rPr>
           <w:rFonts w:ascii="Calibri" w:hAnsi="Calibri" w:cs="Calibri"/>
+          <w:noProof/>
         </w:rPr>
         <w:drawing>
           <wp:inline distT="0" distB="0" distL="0" distR="0" wp14:anchorId="45DEA9E7" wp14:editId="3E206785">
@@ -2741,6 +2751,7 @@
       <w:r>
         <w:rPr>
           <w:rFonts w:ascii="Calibri" w:hAnsi="Calibri" w:cs="Calibri"/>
+          <w:noProof/>
         </w:rPr>
         <w:drawing>
           <wp:inline distT="0" distB="0" distL="0" distR="0" wp14:anchorId="7085572C" wp14:editId="05EAD453">
@@ -2838,6 +2849,7 @@
       <w:r>
         <w:rPr>
           <w:rFonts w:ascii="Calibri" w:hAnsi="Calibri" w:cs="Calibri"/>
+          <w:noProof/>
         </w:rPr>
         <w:drawing>
           <wp:inline distT="0" distB="0" distL="0" distR="0" wp14:anchorId="21978F3A" wp14:editId="37A4A807">
@@ -2935,6 +2947,7 @@
       <w:r>
         <w:rPr>
           <w:rFonts w:ascii="Calibri" w:hAnsi="Calibri" w:cs="Calibri"/>
+          <w:noProof/>
         </w:rPr>
         <w:drawing>
           <wp:inline distT="0" distB="0" distL="0" distR="0" wp14:anchorId="2115D38F" wp14:editId="75E4CF59">
@@ -3041,6 +3054,7 @@
       <w:r>
         <w:rPr>
           <w:rFonts w:ascii="Calibri" w:hAnsi="Calibri" w:cs="Calibri"/>
+          <w:noProof/>
         </w:rPr>
         <w:drawing>
           <wp:inline distT="0" distB="0" distL="0" distR="0" wp14:anchorId="0C574122" wp14:editId="2D97C1B7">
@@ -3195,6 +3209,7 @@
       <w:r>
         <w:rPr>
           <w:rFonts w:ascii="Calibri" w:hAnsi="Calibri" w:cs="Calibri"/>
+          <w:noProof/>
         </w:rPr>
         <w:drawing>
           <wp:inline distT="0" distB="0" distL="0" distR="0" wp14:anchorId="1FFA7BED" wp14:editId="3BC0A755">
@@ -3249,6 +3264,7 @@
       <w:r>
         <w:rPr>
           <w:rFonts w:ascii="Calibri" w:hAnsi="Calibri" w:cs="Calibri"/>
+          <w:noProof/>
         </w:rPr>
         <w:drawing>
           <wp:inline distT="0" distB="0" distL="0" distR="0" wp14:anchorId="0349E1B1" wp14:editId="54AC9A30">
@@ -3316,6 +3332,7 @@
       <w:r>
         <w:rPr>
           <w:rFonts w:ascii="Calibri" w:hAnsi="Calibri" w:cs="Calibri"/>
+          <w:noProof/>
         </w:rPr>
         <w:drawing>
           <wp:inline distT="0" distB="0" distL="0" distR="0" wp14:anchorId="11E82D5A" wp14:editId="107B057B">
@@ -3342,6 +3359,67 @@
                     <a:xfrm>
                       <a:off x="0" y="0"/>
                       <a:ext cx="5943600" cy="3353435"/>
+                    </a:xfrm>
+                    <a:prstGeom prst="rect">
+                      <a:avLst/>
+                    </a:prstGeom>
+                  </pic:spPr>
+                </pic:pic>
+              </a:graphicData>
+            </a:graphic>
+          </wp:inline>
+        </w:drawing>
+      </w:r>
+    </w:p>
+    <w:p>
+      <w:pPr>
+        <w:rPr>
+          <w:rFonts w:ascii="Calibri" w:hAnsi="Calibri" w:cs="Calibri"/>
+        </w:rPr>
+      </w:pPr>
+    </w:p>
+    <w:p>
+      <w:pPr>
+        <w:rPr>
+          <w:rFonts w:ascii="Calibri" w:hAnsi="Calibri" w:cs="Calibri"/>
+        </w:rPr>
+      </w:pPr>
+    </w:p>
+    <w:p>
+      <w:pPr>
+        <w:rPr>
+          <w:rFonts w:ascii="Calibri" w:hAnsi="Calibri" w:cs="Calibri"/>
+        </w:rPr>
+      </w:pPr>
+      <w:r>
+        <w:rPr>
+          <w:rFonts w:ascii="Calibri" w:hAnsi="Calibri" w:cs="Calibri"/>
+        </w:rPr>
+        <w:drawing>
+          <wp:inline distT="0" distB="0" distL="0" distR="0" wp14:anchorId="704AA800" wp14:editId="2F27C645">
+            <wp:extent cx="5943600" cy="2331720"/>
+            <wp:effectExtent l="0" t="0" r="0" b="0"/>
+            <wp:docPr id="533708970" name="Picture 1"/>
+            <wp:cNvGraphicFramePr>
+              <a:graphicFrameLocks xmlns:a="http://schemas.openxmlformats.org/drawingml/2006/main" noChangeAspect="1"/>
+            </wp:cNvGraphicFramePr>
+            <a:graphic xmlns:a="http://schemas.openxmlformats.org/drawingml/2006/main">
+              <a:graphicData uri="http://schemas.openxmlformats.org/drawingml/2006/picture">
+                <pic:pic xmlns:pic="http://schemas.openxmlformats.org/drawingml/2006/picture">
+                  <pic:nvPicPr>
+                    <pic:cNvPr id="533708970" name=""/>
+                    <pic:cNvPicPr/>
+                  </pic:nvPicPr>
+                  <pic:blipFill>
+                    <a:blip r:embed="rId21"/>
+                    <a:stretch>
+                      <a:fillRect/>
+                    </a:stretch>
+                  </pic:blipFill>
+                  <pic:spPr>
+                    <a:xfrm>
+                      <a:off x="0" y="0"/>
+                      <a:ext cx="5943600" cy="2331720"/>
                     </a:xfrm>
                     <a:prstGeom prst="rect">
                       <a:avLst/>
@@ -3965,6 +4043,7 @@
   <w:style w:type="character" w:default="1" w:styleId="DefaultParagraphFont">
     <w:name w:val="Default Paragraph Font"/>
     <w:uiPriority w:val="1"/>
+    <w:semiHidden/>
     <w:unhideWhenUsed/>
   </w:style>
   <w:style w:type="table" w:default="1" w:styleId="TableNormal">

</xml_diff>